<commit_message>
Update HLD and LLD with latest frontend, backend, DB, and DS convergence
</commit_message>
<xml_diff>
--- a/docs/LLD.docx
+++ b/docs/LLD.docx
@@ -2,7 +2,7 @@
 <file path=word/document.xml><?xml version="1.0" encoding="utf-8"?>
 <w:document xmlns:w="http://schemas.openxmlformats.org/wordprocessingml/2006/main" xmlns:m="http://schemas.openxmlformats.org/officeDocument/2006/math" xmlns:r="http://schemas.openxmlformats.org/officeDocument/2006/relationships" xmlns:o="urn:schemas-microsoft-com:office:office" xmlns:v="urn:schemas-microsoft-com:vml" xmlns:w10="urn:schemas-microsoft-com:office:word" xmlns:a="http://schemas.openxmlformats.org/drawingml/2006/main" xmlns:pic="http://schemas.openxmlformats.org/drawingml/2006/picture" xmlns:wp="http://schemas.openxmlformats.org/drawingml/2006/wordprocessingDrawing">
   <w:body>
-    <w:bookmarkStart w:id="79" w:name="X76f88b2687ad45cf359f79bc4105a81cfd3547f"/>
+    <w:bookmarkStart w:id="83" w:name="X76f88b2687ad45cf359f79bc4105a81cfd3547f"/>
     <w:p>
       <w:pPr>
         <w:pStyle w:val="Heading1"/>
@@ -121,6 +121,29 @@
     <w:p>
       <w:pPr>
         <w:pStyle w:val="FirstParagraph"/>
+      </w:pPr>
+      <w:r>
+        <w:t xml:space="preserve">Repository sync note (2026-05-14): this LLD reflects latest merged team contributions currently present in the monorepo, including the parallel</w:t>
+      </w:r>
+      <w:r>
+        <w:t xml:space="preserve"> </w:t>
+      </w:r>
+      <w:r>
+        <w:rPr>
+          <w:rStyle w:val="VerbatimChar"/>
+        </w:rPr>
+        <w:t xml:space="preserve">frontend</w:t>
+      </w:r>
+      <w:r>
+        <w:t xml:space="preserve"> </w:t>
+      </w:r>
+      <w:r>
+        <w:t xml:space="preserve">app and Dockerized Django stack assets.</w:t>
+      </w:r>
+    </w:p>
+    <w:p>
+      <w:pPr>
+        <w:pStyle w:val="BodyText"/>
       </w:pPr>
       <w:r>
         <w:t xml:space="preserve">The goal is to provide implementation-ready detail for API contracts, module responsibilities, runtime flow, algorithms, testing, and operational behavior.</w:t>
@@ -385,7 +408,43 @@
         <w:t xml:space="preserve">pages/</w:t>
       </w:r>
       <w:r>
-        <w:t xml:space="preserve">: top-level route pages (</w:t>
+        <w:t xml:space="preserve">: route pages (</w:t>
+      </w:r>
+      <w:r>
+        <w:rPr>
+          <w:rStyle w:val="VerbatimChar"/>
+        </w:rPr>
+        <w:t xml:space="preserve">Login</w:t>
+      </w:r>
+      <w:r>
+        <w:t xml:space="preserve">,</w:t>
+      </w:r>
+      <w:r>
+        <w:t xml:space="preserve"> </w:t>
+      </w:r>
+      <w:r>
+        <w:rPr>
+          <w:rStyle w:val="VerbatimChar"/>
+        </w:rPr>
+        <w:t xml:space="preserve">RegistrationPage</w:t>
+      </w:r>
+      <w:r>
+        <w:t xml:space="preserve">,</w:t>
+      </w:r>
+      <w:r>
+        <w:t xml:space="preserve"> </w:t>
+      </w:r>
+      <w:r>
+        <w:rPr>
+          <w:rStyle w:val="VerbatimChar"/>
+        </w:rPr>
+        <w:t xml:space="preserve">ForgotPassword</w:t>
+      </w:r>
+      <w:r>
+        <w:t xml:space="preserve">,</w:t>
+      </w:r>
+      <w:r>
+        <w:t xml:space="preserve"> </w:t>
       </w:r>
       <w:r>
         <w:rPr>
@@ -424,7 +483,7 @@
         <w:t xml:space="preserve">components/</w:t>
       </w:r>
       <w:r>
-        <w:t xml:space="preserve">: rendering and interaction units (selectors, charts, stats, correlation cards)</w:t>
+        <w:t xml:space="preserve">: rendering and interaction units (selectors, charts, stats, correlation cards, shared layout/navbar/footer, dataset card, route guard)</w:t>
       </w:r>
     </w:p>
     <w:p>
@@ -481,6 +540,33 @@
         <w:t xml:space="preserve">: mock datasets for offline mode</w:t>
       </w:r>
     </w:p>
+    <w:p>
+      <w:pPr>
+        <w:numPr>
+          <w:ilvl w:val="0"/>
+          <w:numId w:val="1004"/>
+        </w:numPr>
+        <w:pStyle w:val="Compact"/>
+      </w:pPr>
+      <w:r>
+        <w:rPr>
+          <w:rStyle w:val="VerbatimChar"/>
+        </w:rPr>
+        <w:t xml:space="preserve">services/</w:t>
+      </w:r>
+      <w:r>
+        <w:t xml:space="preserve">: auth integration seam (</w:t>
+      </w:r>
+      <w:r>
+        <w:rPr>
+          <w:rStyle w:val="VerbatimChar"/>
+        </w:rPr>
+        <w:t xml:space="preserve">authClient.js</w:t>
+      </w:r>
+      <w:r>
+        <w:t xml:space="preserve">)</w:t>
+      </w:r>
+    </w:p>
     <w:bookmarkStart w:id="25" w:name="Xc1f31469460d1b87d24545d5332943734517685"/>
     <w:p>
       <w:pPr>
@@ -587,6 +673,60 @@
       </w:r>
       <w:r>
         <w:t xml:space="preserve">: file-based data access</w:t>
+      </w:r>
+    </w:p>
+    <w:p>
+      <w:pPr>
+        <w:numPr>
+          <w:ilvl w:val="0"/>
+          <w:numId w:val="1005"/>
+        </w:numPr>
+        <w:pStyle w:val="Compact"/>
+      </w:pPr>
+      <w:r>
+        <w:rPr>
+          <w:rStyle w:val="VerbatimChar"/>
+        </w:rPr>
+        <w:t xml:space="preserve">middleware/</w:t>
+      </w:r>
+      <w:r>
+        <w:t xml:space="preserve">: request guards (JWT verification middleware from PR #70)</w:t>
+      </w:r>
+    </w:p>
+    <w:p>
+      <w:pPr>
+        <w:numPr>
+          <w:ilvl w:val="0"/>
+          <w:numId w:val="1005"/>
+        </w:numPr>
+        <w:pStyle w:val="Compact"/>
+      </w:pPr>
+      <w:r>
+        <w:rPr>
+          <w:rStyle w:val="VerbatimChar"/>
+        </w:rPr>
+        <w:t xml:space="preserve">utils/</w:t>
+      </w:r>
+      <w:r>
+        <w:t xml:space="preserve">: helper utilities for token and hashing workflows (PR #70)</w:t>
+      </w:r>
+    </w:p>
+    <w:p>
+      <w:pPr>
+        <w:numPr>
+          <w:ilvl w:val="0"/>
+          <w:numId w:val="1005"/>
+        </w:numPr>
+        <w:pStyle w:val="Compact"/>
+      </w:pPr>
+      <w:r>
+        <w:rPr>
+          <w:rStyle w:val="VerbatimChar"/>
+        </w:rPr>
+        <w:t xml:space="preserve">config/</w:t>
+      </w:r>
+      <w:r>
+        <w:t xml:space="preserve">: auth-related configuration seam (PR #70)</w:t>
       </w:r>
     </w:p>
     <w:p>
@@ -621,7 +761,19 @@
         <w:pStyle w:val="FirstParagraph"/>
       </w:pPr>
       <w:r>
-        <w:t xml:space="preserve">File:</w:t>
+        <w:t xml:space="preserve">Files:</w:t>
+      </w:r>
+      <w:r>
+        <w:t xml:space="preserve"> </w:t>
+      </w:r>
+      <w:r>
+        <w:rPr>
+          <w:rStyle w:val="VerbatimChar"/>
+        </w:rPr>
+        <w:t xml:space="preserve">newBackend/BackendCode/app.js</w:t>
+      </w:r>
+      <w:r>
+        <w:t xml:space="preserve">,</w:t>
       </w:r>
       <w:r>
         <w:t xml:space="preserve"> </w:t>
@@ -642,7 +794,16 @@
         <w:pStyle w:val="Compact"/>
       </w:pPr>
       <w:r>
-        <w:t xml:space="preserve">Load env from</w:t>
+        <w:rPr>
+          <w:rStyle w:val="VerbatimChar"/>
+        </w:rPr>
+        <w:t xml:space="preserve">app.js</w:t>
+      </w:r>
+      <w:r>
+        <w:t xml:space="preserve"> </w:t>
+      </w:r>
+      <w:r>
+        <w:t xml:space="preserve">loads env from</w:t>
       </w:r>
       <w:r>
         <w:t xml:space="preserve"> </w:t>
@@ -663,7 +824,16 @@
         <w:pStyle w:val="Compact"/>
       </w:pPr>
       <w:r>
-        <w:t xml:space="preserve">Create Express app</w:t>
+        <w:rPr>
+          <w:rStyle w:val="VerbatimChar"/>
+        </w:rPr>
+        <w:t xml:space="preserve">app.js</w:t>
+      </w:r>
+      <w:r>
+        <w:t xml:space="preserve"> </w:t>
+      </w:r>
+      <w:r>
+        <w:t xml:space="preserve">creates Express app</w:t>
       </w:r>
     </w:p>
     <w:p>
@@ -675,7 +845,16 @@
         <w:pStyle w:val="Compact"/>
       </w:pPr>
       <w:r>
-        <w:t xml:space="preserve">Register middleware:</w:t>
+        <w:rPr>
+          <w:rStyle w:val="VerbatimChar"/>
+        </w:rPr>
+        <w:t xml:space="preserve">app.js</w:t>
+      </w:r>
+      <w:r>
+        <w:t xml:space="preserve"> </w:t>
+      </w:r>
+      <w:r>
+        <w:t xml:space="preserve">registers middleware:</w:t>
       </w:r>
     </w:p>
     <w:p>
@@ -717,7 +896,16 @@
         <w:pStyle w:val="Compact"/>
       </w:pPr>
       <w:r>
-        <w:t xml:space="preserve">Register health/root route (</w:t>
+        <w:rPr>
+          <w:rStyle w:val="VerbatimChar"/>
+        </w:rPr>
+        <w:t xml:space="preserve">app.js</w:t>
+      </w:r>
+      <w:r>
+        <w:t xml:space="preserve"> </w:t>
+      </w:r>
+      <w:r>
+        <w:t xml:space="preserve">registers root and health routes (</w:t>
       </w:r>
       <w:r>
         <w:rPr>
@@ -726,6 +914,18 @@
         <w:t xml:space="preserve">GET /</w:t>
       </w:r>
       <w:r>
+        <w:t xml:space="preserve">,</w:t>
+      </w:r>
+      <w:r>
+        <w:t xml:space="preserve"> </w:t>
+      </w:r>
+      <w:r>
+        <w:rPr>
+          <w:rStyle w:val="VerbatimChar"/>
+        </w:rPr>
+        <w:t xml:space="preserve">GET /health</w:t>
+      </w:r>
+      <w:r>
         <w:t xml:space="preserve">)</w:t>
       </w:r>
     </w:p>
@@ -738,7 +938,16 @@
         <w:pStyle w:val="Compact"/>
       </w:pPr>
       <w:r>
-        <w:t xml:space="preserve">Mount API routes under</w:t>
+        <w:rPr>
+          <w:rStyle w:val="VerbatimChar"/>
+        </w:rPr>
+        <w:t xml:space="preserve">app.js</w:t>
+      </w:r>
+      <w:r>
+        <w:t xml:space="preserve"> </w:t>
+      </w:r>
+      <w:r>
+        <w:t xml:space="preserve">mounts API routes under</w:t>
       </w:r>
       <w:r>
         <w:t xml:space="preserve"> </w:t>
@@ -759,7 +968,16 @@
         <w:pStyle w:val="Compact"/>
       </w:pPr>
       <w:r>
-        <w:t xml:space="preserve">Bind server to</w:t>
+        <w:rPr>
+          <w:rStyle w:val="VerbatimChar"/>
+        </w:rPr>
+        <w:t xml:space="preserve">server.js</w:t>
+      </w:r>
+      <w:r>
+        <w:t xml:space="preserve"> </w:t>
+      </w:r>
+      <w:r>
+        <w:t xml:space="preserve">imports app and binds server to</w:t>
       </w:r>
       <w:r>
         <w:t xml:space="preserve"> </w:t>
@@ -2845,11 +3063,296 @@
         <w:pStyle w:val="Compact"/>
       </w:pPr>
       <w:r>
+        <w:t xml:space="preserve">Public routes:</w:t>
+      </w:r>
+    </w:p>
+    <w:p>
+      <w:pPr>
+        <w:numPr>
+          <w:ilvl w:val="1"/>
+          <w:numId w:val="1029"/>
+        </w:numPr>
+        <w:pStyle w:val="Compact"/>
+      </w:pPr>
+      <w:r>
+        <w:rPr>
+          <w:rStyle w:val="VerbatimChar"/>
+        </w:rPr>
+        <w:t xml:space="preserve">/</w:t>
+      </w:r>
+      <w:r>
+        <w:t xml:space="preserve"> </w:t>
+      </w:r>
+      <w:r>
+        <w:t xml:space="preserve">-&gt;</w:t>
+      </w:r>
+      <w:r>
+        <w:t xml:space="preserve"> </w:t>
+      </w:r>
+      <w:r>
+        <w:rPr>
+          <w:rStyle w:val="VerbatimChar"/>
+        </w:rPr>
+        <w:t xml:space="preserve">Login</w:t>
+      </w:r>
+    </w:p>
+    <w:p>
+      <w:pPr>
+        <w:numPr>
+          <w:ilvl w:val="1"/>
+          <w:numId w:val="1029"/>
+        </w:numPr>
+        <w:pStyle w:val="Compact"/>
+      </w:pPr>
+      <w:r>
+        <w:rPr>
+          <w:rStyle w:val="VerbatimChar"/>
+        </w:rPr>
+        <w:t xml:space="preserve">/register</w:t>
+      </w:r>
+      <w:r>
+        <w:t xml:space="preserve"> </w:t>
+      </w:r>
+      <w:r>
+        <w:t xml:space="preserve">-&gt;</w:t>
+      </w:r>
+      <w:r>
+        <w:t xml:space="preserve"> </w:t>
+      </w:r>
+      <w:r>
+        <w:rPr>
+          <w:rStyle w:val="VerbatimChar"/>
+        </w:rPr>
+        <w:t xml:space="preserve">RegistrationPage</w:t>
+      </w:r>
+    </w:p>
+    <w:p>
+      <w:pPr>
+        <w:numPr>
+          <w:ilvl w:val="1"/>
+          <w:numId w:val="1029"/>
+        </w:numPr>
+        <w:pStyle w:val="Compact"/>
+      </w:pPr>
+      <w:r>
+        <w:rPr>
+          <w:rStyle w:val="VerbatimChar"/>
+        </w:rPr>
+        <w:t xml:space="preserve">/forgot-password</w:t>
+      </w:r>
+      <w:r>
+        <w:t xml:space="preserve"> </w:t>
+      </w:r>
+      <w:r>
+        <w:t xml:space="preserve">-&gt;</w:t>
+      </w:r>
+      <w:r>
+        <w:t xml:space="preserve"> </w:t>
+      </w:r>
+      <w:r>
+        <w:rPr>
+          <w:rStyle w:val="VerbatimChar"/>
+        </w:rPr>
+        <w:t xml:space="preserve">ForgotPassword</w:t>
+      </w:r>
+    </w:p>
+    <w:p>
+      <w:pPr>
+        <w:numPr>
+          <w:ilvl w:val="0"/>
+          <w:numId w:val="1028"/>
+        </w:numPr>
+        <w:pStyle w:val="Compact"/>
+      </w:pPr>
+      <w:r>
+        <w:t xml:space="preserve">Protected routes:</w:t>
+      </w:r>
+    </w:p>
+    <w:p>
+      <w:pPr>
+        <w:numPr>
+          <w:ilvl w:val="1"/>
+          <w:numId w:val="1030"/>
+        </w:numPr>
+        <w:pStyle w:val="Compact"/>
+      </w:pPr>
+      <w:r>
+        <w:rPr>
+          <w:rStyle w:val="VerbatimChar"/>
+        </w:rPr>
+        <w:t xml:space="preserve">/home</w:t>
+      </w:r>
+      <w:r>
+        <w:t xml:space="preserve"> </w:t>
+      </w:r>
+      <w:r>
+        <w:t xml:space="preserve">-&gt;</w:t>
+      </w:r>
+      <w:r>
+        <w:t xml:space="preserve"> </w:t>
+      </w:r>
+      <w:r>
+        <w:rPr>
+          <w:rStyle w:val="VerbatimChar"/>
+        </w:rPr>
+        <w:t xml:space="preserve">ProtectedRoute</w:t>
+      </w:r>
+      <w:r>
+        <w:t xml:space="preserve"> </w:t>
+      </w:r>
+      <w:r>
+        <w:t xml:space="preserve">-&gt;</w:t>
+      </w:r>
+      <w:r>
+        <w:t xml:space="preserve"> </w:t>
+      </w:r>
+      <w:r>
+        <w:rPr>
+          <w:rStyle w:val="VerbatimChar"/>
+        </w:rPr>
+        <w:t xml:space="preserve">Layout</w:t>
+      </w:r>
+      <w:r>
+        <w:t xml:space="preserve"> </w:t>
+      </w:r>
+      <w:r>
+        <w:t xml:space="preserve">-&gt;</w:t>
+      </w:r>
+      <w:r>
+        <w:t xml:space="preserve"> </w:t>
+      </w:r>
+      <w:r>
+        <w:rPr>
+          <w:rStyle w:val="VerbatimChar"/>
+        </w:rPr>
+        <w:t xml:space="preserve">HomePage</w:t>
+      </w:r>
+    </w:p>
+    <w:p>
+      <w:pPr>
+        <w:numPr>
+          <w:ilvl w:val="1"/>
+          <w:numId w:val="1030"/>
+        </w:numPr>
+        <w:pStyle w:val="Compact"/>
+      </w:pPr>
+      <w:r>
+        <w:rPr>
+          <w:rStyle w:val="VerbatimChar"/>
+        </w:rPr>
+        <w:t xml:space="preserve">/dashboard/:id</w:t>
+      </w:r>
+      <w:r>
+        <w:t xml:space="preserve"> </w:t>
+      </w:r>
+      <w:r>
+        <w:t xml:space="preserve">-&gt;</w:t>
+      </w:r>
+      <w:r>
+        <w:t xml:space="preserve"> </w:t>
+      </w:r>
+      <w:r>
+        <w:rPr>
+          <w:rStyle w:val="VerbatimChar"/>
+        </w:rPr>
+        <w:t xml:space="preserve">ProtectedRoute</w:t>
+      </w:r>
+      <w:r>
+        <w:t xml:space="preserve"> </w:t>
+      </w:r>
+      <w:r>
+        <w:t xml:space="preserve">-&gt;</w:t>
+      </w:r>
+      <w:r>
+        <w:t xml:space="preserve"> </w:t>
+      </w:r>
+      <w:r>
+        <w:rPr>
+          <w:rStyle w:val="VerbatimChar"/>
+        </w:rPr>
+        <w:t xml:space="preserve">Layout</w:t>
+      </w:r>
+      <w:r>
+        <w:t xml:space="preserve"> </w:t>
+      </w:r>
+      <w:r>
+        <w:t xml:space="preserve">-&gt;</w:t>
+      </w:r>
+      <w:r>
+        <w:t xml:space="preserve"> </w:t>
+      </w:r>
+      <w:r>
         <w:rPr>
           <w:rStyle w:val="VerbatimChar"/>
         </w:rPr>
         <w:t xml:space="preserve">DashboardPage</w:t>
       </w:r>
+    </w:p>
+    <w:p>
+      <w:pPr>
+        <w:numPr>
+          <w:ilvl w:val="0"/>
+          <w:numId w:val="1028"/>
+        </w:numPr>
+        <w:pStyle w:val="Compact"/>
+      </w:pPr>
+      <w:r>
+        <w:rPr>
+          <w:rStyle w:val="VerbatimChar"/>
+        </w:rPr>
+        <w:t xml:space="preserve">Layout</w:t>
+      </w:r>
+      <w:r>
+        <w:t xml:space="preserve"> </w:t>
+      </w:r>
+      <w:r>
+        <w:t xml:space="preserve">composes shared</w:t>
+      </w:r>
+      <w:r>
+        <w:t xml:space="preserve"> </w:t>
+      </w:r>
+      <w:r>
+        <w:rPr>
+          <w:rStyle w:val="VerbatimChar"/>
+        </w:rPr>
+        <w:t xml:space="preserve">Navbar</w:t>
+      </w:r>
+      <w:r>
+        <w:t xml:space="preserve"> </w:t>
+      </w:r>
+      <w:r>
+        <w:t xml:space="preserve">and</w:t>
+      </w:r>
+      <w:r>
+        <w:t xml:space="preserve"> </w:t>
+      </w:r>
+      <w:r>
+        <w:rPr>
+          <w:rStyle w:val="VerbatimChar"/>
+        </w:rPr>
+        <w:t xml:space="preserve">Footer</w:t>
+      </w:r>
+      <w:r>
+        <w:t xml:space="preserve"> </w:t>
+      </w:r>
+      <w:r>
+        <w:t xml:space="preserve">around protected content.</w:t>
+      </w:r>
+    </w:p>
+    <w:p>
+      <w:pPr>
+        <w:numPr>
+          <w:ilvl w:val="0"/>
+          <w:numId w:val="1028"/>
+        </w:numPr>
+        <w:pStyle w:val="Compact"/>
+      </w:pPr>
+      <w:r>
+        <w:rPr>
+          <w:rStyle w:val="VerbatimChar"/>
+        </w:rPr>
+        <w:t xml:space="preserve">DashboardPage</w:t>
+      </w:r>
       <w:r>
         <w:t xml:space="preserve"> </w:t>
       </w:r>
@@ -2869,7 +3372,7 @@
         <w:t xml:space="preserve"> </w:t>
       </w:r>
       <w:r>
-        <w:t xml:space="preserve">feature composition</w:t>
+        <w:t xml:space="preserve">feature composition.</w:t>
       </w:r>
     </w:p>
     <w:p>
@@ -2881,7 +3384,7 @@
         <w:pStyle w:val="Compact"/>
       </w:pPr>
       <w:r>
-        <w:t xml:space="preserve">Dashboard contains selection controls, charting, stats, and correlation insights</w:t>
+        <w:t xml:space="preserve">Dashboard contains selection controls, charting, stats, and correlation insights.</w:t>
       </w:r>
     </w:p>
     <w:bookmarkEnd w:id="41"/>
@@ -2927,7 +3430,7 @@
       <w:pPr>
         <w:numPr>
           <w:ilvl w:val="0"/>
-          <w:numId w:val="1029"/>
+          <w:numId w:val="1031"/>
         </w:numPr>
         <w:pStyle w:val="Compact"/>
       </w:pPr>
@@ -2948,7 +3451,7 @@
       <w:pPr>
         <w:numPr>
           <w:ilvl w:val="0"/>
-          <w:numId w:val="1029"/>
+          <w:numId w:val="1031"/>
         </w:numPr>
         <w:pStyle w:val="Compact"/>
       </w:pPr>
@@ -2981,7 +3484,7 @@
       <w:pPr>
         <w:numPr>
           <w:ilvl w:val="0"/>
-          <w:numId w:val="1029"/>
+          <w:numId w:val="1031"/>
         </w:numPr>
         <w:pStyle w:val="Compact"/>
       </w:pPr>
@@ -3038,7 +3541,7 @@
       <w:pPr>
         <w:numPr>
           <w:ilvl w:val="0"/>
-          <w:numId w:val="1030"/>
+          <w:numId w:val="1032"/>
         </w:numPr>
         <w:pStyle w:val="Compact"/>
       </w:pPr>
@@ -3050,7 +3553,7 @@
       <w:pPr>
         <w:numPr>
           <w:ilvl w:val="0"/>
-          <w:numId w:val="1030"/>
+          <w:numId w:val="1032"/>
         </w:numPr>
         <w:pStyle w:val="Compact"/>
       </w:pPr>
@@ -3083,7 +3586,7 @@
       <w:pPr>
         <w:numPr>
           <w:ilvl w:val="0"/>
-          <w:numId w:val="1030"/>
+          <w:numId w:val="1032"/>
         </w:numPr>
         <w:pStyle w:val="Compact"/>
       </w:pPr>
@@ -3134,7 +3637,7 @@
       <w:pPr>
         <w:numPr>
           <w:ilvl w:val="0"/>
-          <w:numId w:val="1031"/>
+          <w:numId w:val="1033"/>
         </w:numPr>
         <w:pStyle w:val="Compact"/>
       </w:pPr>
@@ -3146,7 +3649,7 @@
       <w:pPr>
         <w:numPr>
           <w:ilvl w:val="1"/>
-          <w:numId w:val="1032"/>
+          <w:numId w:val="1034"/>
         </w:numPr>
         <w:pStyle w:val="Compact"/>
       </w:pPr>
@@ -3179,7 +3682,7 @@
       <w:pPr>
         <w:numPr>
           <w:ilvl w:val="1"/>
-          <w:numId w:val="1032"/>
+          <w:numId w:val="1034"/>
         </w:numPr>
         <w:pStyle w:val="Compact"/>
       </w:pPr>
@@ -3212,7 +3715,7 @@
       <w:pPr>
         <w:numPr>
           <w:ilvl w:val="0"/>
-          <w:numId w:val="1031"/>
+          <w:numId w:val="1033"/>
         </w:numPr>
         <w:pStyle w:val="Compact"/>
       </w:pPr>
@@ -3252,7 +3755,7 @@
       <w:pPr>
         <w:numPr>
           <w:ilvl w:val="0"/>
-          <w:numId w:val="1033"/>
+          <w:numId w:val="1035"/>
         </w:numPr>
         <w:pStyle w:val="Compact"/>
       </w:pPr>
@@ -3270,7 +3773,7 @@
       <w:pPr>
         <w:numPr>
           <w:ilvl w:val="0"/>
-          <w:numId w:val="1033"/>
+          <w:numId w:val="1035"/>
         </w:numPr>
         <w:pStyle w:val="Compact"/>
       </w:pPr>
@@ -3288,7 +3791,7 @@
       <w:pPr>
         <w:numPr>
           <w:ilvl w:val="0"/>
-          <w:numId w:val="1033"/>
+          <w:numId w:val="1035"/>
         </w:numPr>
         <w:pStyle w:val="Compact"/>
       </w:pPr>
@@ -3306,7 +3809,7 @@
       <w:pPr>
         <w:numPr>
           <w:ilvl w:val="0"/>
-          <w:numId w:val="1033"/>
+          <w:numId w:val="1035"/>
         </w:numPr>
         <w:pStyle w:val="Compact"/>
       </w:pPr>
@@ -3332,7 +3835,7 @@
       <w:pPr>
         <w:numPr>
           <w:ilvl w:val="0"/>
-          <w:numId w:val="1034"/>
+          <w:numId w:val="1036"/>
         </w:numPr>
         <w:pStyle w:val="Compact"/>
       </w:pPr>
@@ -3353,7 +3856,7 @@
       <w:pPr>
         <w:numPr>
           <w:ilvl w:val="0"/>
-          <w:numId w:val="1034"/>
+          <w:numId w:val="1036"/>
         </w:numPr>
         <w:pStyle w:val="Compact"/>
       </w:pPr>
@@ -3427,7 +3930,7 @@
       <w:pPr>
         <w:numPr>
           <w:ilvl w:val="0"/>
-          <w:numId w:val="1035"/>
+          <w:numId w:val="1037"/>
         </w:numPr>
         <w:pStyle w:val="Compact"/>
       </w:pPr>
@@ -3439,7 +3942,7 @@
       <w:pPr>
         <w:numPr>
           <w:ilvl w:val="0"/>
-          <w:numId w:val="1035"/>
+          <w:numId w:val="1037"/>
         </w:numPr>
         <w:pStyle w:val="Compact"/>
       </w:pPr>
@@ -3460,7 +3963,7 @@
       <w:pPr>
         <w:numPr>
           <w:ilvl w:val="0"/>
-          <w:numId w:val="1035"/>
+          <w:numId w:val="1037"/>
         </w:numPr>
         <w:pStyle w:val="Compact"/>
       </w:pPr>
@@ -3481,7 +3984,7 @@
       <w:pPr>
         <w:numPr>
           <w:ilvl w:val="0"/>
-          <w:numId w:val="1035"/>
+          <w:numId w:val="1037"/>
         </w:numPr>
         <w:pStyle w:val="Compact"/>
       </w:pPr>
@@ -3532,7 +4035,7 @@
       <w:pPr>
         <w:numPr>
           <w:ilvl w:val="0"/>
-          <w:numId w:val="1036"/>
+          <w:numId w:val="1038"/>
         </w:numPr>
         <w:pStyle w:val="Compact"/>
       </w:pPr>
@@ -3553,7 +4056,7 @@
       <w:pPr>
         <w:numPr>
           <w:ilvl w:val="0"/>
-          <w:numId w:val="1036"/>
+          <w:numId w:val="1038"/>
         </w:numPr>
         <w:pStyle w:val="Compact"/>
       </w:pPr>
@@ -3565,7 +4068,7 @@
       <w:pPr>
         <w:numPr>
           <w:ilvl w:val="0"/>
-          <w:numId w:val="1036"/>
+          <w:numId w:val="1038"/>
         </w:numPr>
         <w:pStyle w:val="Compact"/>
       </w:pPr>
@@ -3586,7 +4089,7 @@
       <w:pPr>
         <w:numPr>
           <w:ilvl w:val="0"/>
-          <w:numId w:val="1036"/>
+          <w:numId w:val="1038"/>
         </w:numPr>
         <w:pStyle w:val="Compact"/>
       </w:pPr>
@@ -3615,7 +4118,7 @@
       <w:pPr>
         <w:numPr>
           <w:ilvl w:val="0"/>
-          <w:numId w:val="1037"/>
+          <w:numId w:val="1039"/>
         </w:numPr>
         <w:pStyle w:val="Compact"/>
       </w:pPr>
@@ -3651,7 +4154,7 @@
       <w:pPr>
         <w:numPr>
           <w:ilvl w:val="0"/>
-          <w:numId w:val="1037"/>
+          <w:numId w:val="1039"/>
         </w:numPr>
         <w:pStyle w:val="Compact"/>
       </w:pPr>
@@ -3672,7 +4175,7 @@
       <w:pPr>
         <w:numPr>
           <w:ilvl w:val="0"/>
-          <w:numId w:val="1037"/>
+          <w:numId w:val="1039"/>
         </w:numPr>
         <w:pStyle w:val="Compact"/>
       </w:pPr>
@@ -3720,7 +4223,7 @@
       <w:pPr>
         <w:numPr>
           <w:ilvl w:val="0"/>
-          <w:numId w:val="1038"/>
+          <w:numId w:val="1040"/>
         </w:numPr>
         <w:pStyle w:val="Compact"/>
       </w:pPr>
@@ -3741,7 +4244,7 @@
       <w:pPr>
         <w:numPr>
           <w:ilvl w:val="0"/>
-          <w:numId w:val="1038"/>
+          <w:numId w:val="1040"/>
         </w:numPr>
         <w:pStyle w:val="Compact"/>
       </w:pPr>
@@ -3780,7 +4283,7 @@
       <w:pPr>
         <w:numPr>
           <w:ilvl w:val="0"/>
-          <w:numId w:val="1039"/>
+          <w:numId w:val="1041"/>
         </w:numPr>
         <w:pStyle w:val="Compact"/>
       </w:pPr>
@@ -3792,7 +4295,7 @@
       <w:pPr>
         <w:numPr>
           <w:ilvl w:val="0"/>
-          <w:numId w:val="1039"/>
+          <w:numId w:val="1041"/>
         </w:numPr>
         <w:pStyle w:val="Compact"/>
       </w:pPr>
@@ -3804,7 +4307,7 @@
       <w:pPr>
         <w:numPr>
           <w:ilvl w:val="0"/>
-          <w:numId w:val="1039"/>
+          <w:numId w:val="1041"/>
         </w:numPr>
         <w:pStyle w:val="Compact"/>
       </w:pPr>
@@ -3848,7 +4351,7 @@
       <w:pPr>
         <w:numPr>
           <w:ilvl w:val="0"/>
-          <w:numId w:val="1040"/>
+          <w:numId w:val="1042"/>
         </w:numPr>
         <w:pStyle w:val="Compact"/>
       </w:pPr>
@@ -3869,12 +4372,24 @@
       <w:pPr>
         <w:numPr>
           <w:ilvl w:val="0"/>
-          <w:numId w:val="1040"/>
+          <w:numId w:val="1042"/>
         </w:numPr>
         <w:pStyle w:val="Compact"/>
       </w:pPr>
       <w:r>
         <w:t xml:space="preserve">UI text mentions rolling correlation, but active code currently renders static pairwise correlation and trendline only</w:t>
+      </w:r>
+    </w:p>
+    <w:p>
+      <w:pPr>
+        <w:numPr>
+          <w:ilvl w:val="0"/>
+          <w:numId w:val="1042"/>
+        </w:numPr>
+        <w:pStyle w:val="Compact"/>
+      </w:pPr>
+      <w:r>
+        <w:t xml:space="preserve">Auth flow and protected-route shell are now implemented at router level (PR #71), but final token/session contract must be aligned with backend APIs.</w:t>
       </w:r>
     </w:p>
     <w:p>
@@ -4166,7 +4681,7 @@
       <w:pPr>
         <w:numPr>
           <w:ilvl w:val="0"/>
-          <w:numId w:val="1041"/>
+          <w:numId w:val="1043"/>
         </w:numPr>
         <w:pStyle w:val="Compact"/>
       </w:pPr>
@@ -4184,7 +4699,7 @@
       <w:pPr>
         <w:numPr>
           <w:ilvl w:val="0"/>
-          <w:numId w:val="1041"/>
+          <w:numId w:val="1043"/>
         </w:numPr>
         <w:pStyle w:val="Compact"/>
       </w:pPr>
@@ -4202,7 +4717,7 @@
       <w:pPr>
         <w:numPr>
           <w:ilvl w:val="0"/>
-          <w:numId w:val="1041"/>
+          <w:numId w:val="1043"/>
         </w:numPr>
         <w:pStyle w:val="Compact"/>
       </w:pPr>
@@ -4214,7 +4729,7 @@
       <w:pPr>
         <w:numPr>
           <w:ilvl w:val="0"/>
-          <w:numId w:val="1041"/>
+          <w:numId w:val="1043"/>
         </w:numPr>
         <w:pStyle w:val="Compact"/>
       </w:pPr>
@@ -4242,7 +4757,7 @@
       <w:pPr>
         <w:numPr>
           <w:ilvl w:val="0"/>
-          <w:numId w:val="1042"/>
+          <w:numId w:val="1044"/>
         </w:numPr>
         <w:pStyle w:val="Compact"/>
       </w:pPr>
@@ -4275,7 +4790,7 @@
       <w:pPr>
         <w:numPr>
           <w:ilvl w:val="0"/>
-          <w:numId w:val="1042"/>
+          <w:numId w:val="1044"/>
         </w:numPr>
         <w:pStyle w:val="Compact"/>
       </w:pPr>
@@ -4287,7 +4802,7 @@
       <w:pPr>
         <w:numPr>
           <w:ilvl w:val="0"/>
-          <w:numId w:val="1042"/>
+          <w:numId w:val="1044"/>
         </w:numPr>
         <w:pStyle w:val="Compact"/>
       </w:pPr>
@@ -4341,7 +4856,7 @@
       <w:pPr>
         <w:numPr>
           <w:ilvl w:val="0"/>
-          <w:numId w:val="1043"/>
+          <w:numId w:val="1045"/>
         </w:numPr>
         <w:pStyle w:val="Compact"/>
       </w:pPr>
@@ -4362,7 +4877,7 @@
       <w:pPr>
         <w:numPr>
           <w:ilvl w:val="0"/>
-          <w:numId w:val="1043"/>
+          <w:numId w:val="1045"/>
         </w:numPr>
         <w:pStyle w:val="Compact"/>
       </w:pPr>
@@ -4389,7 +4904,7 @@
       <w:pPr>
         <w:numPr>
           <w:ilvl w:val="0"/>
-          <w:numId w:val="1043"/>
+          <w:numId w:val="1045"/>
         </w:numPr>
         <w:pStyle w:val="Compact"/>
       </w:pPr>
@@ -4410,7 +4925,7 @@
       <w:pPr>
         <w:numPr>
           <w:ilvl w:val="0"/>
-          <w:numId w:val="1043"/>
+          <w:numId w:val="1045"/>
         </w:numPr>
         <w:pStyle w:val="Compact"/>
       </w:pPr>
@@ -4456,7 +4971,7 @@
       <w:pPr>
         <w:numPr>
           <w:ilvl w:val="0"/>
-          <w:numId w:val="1044"/>
+          <w:numId w:val="1046"/>
         </w:numPr>
         <w:pStyle w:val="Compact"/>
       </w:pPr>
@@ -4468,7 +4983,7 @@
       <w:pPr>
         <w:numPr>
           <w:ilvl w:val="0"/>
-          <w:numId w:val="1044"/>
+          <w:numId w:val="1046"/>
         </w:numPr>
         <w:pStyle w:val="Compact"/>
       </w:pPr>
@@ -4498,7 +5013,7 @@
       <w:pPr>
         <w:numPr>
           <w:ilvl w:val="0"/>
-          <w:numId w:val="1044"/>
+          <w:numId w:val="1046"/>
         </w:numPr>
         <w:pStyle w:val="Compact"/>
       </w:pPr>
@@ -4519,7 +5034,7 @@
       <w:pPr>
         <w:numPr>
           <w:ilvl w:val="0"/>
-          <w:numId w:val="1044"/>
+          <w:numId w:val="1046"/>
         </w:numPr>
         <w:pStyle w:val="Compact"/>
       </w:pPr>
@@ -4541,7 +5056,7 @@
       <w:pPr>
         <w:numPr>
           <w:ilvl w:val="0"/>
-          <w:numId w:val="1045"/>
+          <w:numId w:val="1047"/>
         </w:numPr>
         <w:pStyle w:val="Compact"/>
       </w:pPr>
@@ -4553,7 +5068,7 @@
       <w:pPr>
         <w:numPr>
           <w:ilvl w:val="0"/>
-          <w:numId w:val="1045"/>
+          <w:numId w:val="1047"/>
         </w:numPr>
         <w:pStyle w:val="Compact"/>
       </w:pPr>
@@ -4574,7 +5089,7 @@
       <w:pPr>
         <w:numPr>
           <w:ilvl w:val="0"/>
-          <w:numId w:val="1045"/>
+          <w:numId w:val="1047"/>
         </w:numPr>
         <w:pStyle w:val="Compact"/>
       </w:pPr>
@@ -4595,7 +5110,7 @@
       <w:pPr>
         <w:numPr>
           <w:ilvl w:val="0"/>
-          <w:numId w:val="1045"/>
+          <w:numId w:val="1047"/>
         </w:numPr>
         <w:pStyle w:val="Compact"/>
       </w:pPr>
@@ -4634,7 +5149,7 @@
       <w:pPr>
         <w:numPr>
           <w:ilvl w:val="0"/>
-          <w:numId w:val="1046"/>
+          <w:numId w:val="1048"/>
         </w:numPr>
         <w:pStyle w:val="Compact"/>
       </w:pPr>
@@ -4655,7 +5170,7 @@
       <w:pPr>
         <w:numPr>
           <w:ilvl w:val="0"/>
-          <w:numId w:val="1046"/>
+          <w:numId w:val="1048"/>
         </w:numPr>
         <w:pStyle w:val="Compact"/>
       </w:pPr>
@@ -4676,7 +5191,7 @@
       <w:pPr>
         <w:numPr>
           <w:ilvl w:val="0"/>
-          <w:numId w:val="1046"/>
+          <w:numId w:val="1048"/>
         </w:numPr>
         <w:pStyle w:val="Compact"/>
       </w:pPr>
@@ -4691,6 +5206,60 @@
           <w:rStyle w:val="VerbatimChar"/>
         </w:rPr>
         <w:t xml:space="preserve">404</w:t>
+      </w:r>
+    </w:p>
+    <w:p>
+      <w:pPr>
+        <w:numPr>
+          <w:ilvl w:val="0"/>
+          <w:numId w:val="1048"/>
+        </w:numPr>
+        <w:pStyle w:val="Compact"/>
+      </w:pPr>
+      <w:r>
+        <w:t xml:space="preserve">auth middleware path returns</w:t>
+      </w:r>
+      <w:r>
+        <w:t xml:space="preserve"> </w:t>
+      </w:r>
+      <w:r>
+        <w:rPr>
+          <w:rStyle w:val="VerbatimChar"/>
+        </w:rPr>
+        <w:t xml:space="preserve">401</w:t>
+      </w:r>
+      <w:r>
+        <w:t xml:space="preserve"> </w:t>
+      </w:r>
+      <w:r>
+        <w:t xml:space="preserve">when token is missing</w:t>
+      </w:r>
+    </w:p>
+    <w:p>
+      <w:pPr>
+        <w:numPr>
+          <w:ilvl w:val="0"/>
+          <w:numId w:val="1048"/>
+        </w:numPr>
+        <w:pStyle w:val="Compact"/>
+      </w:pPr>
+      <w:r>
+        <w:t xml:space="preserve">auth middleware path returns</w:t>
+      </w:r>
+      <w:r>
+        <w:t xml:space="preserve"> </w:t>
+      </w:r>
+      <w:r>
+        <w:rPr>
+          <w:rStyle w:val="VerbatimChar"/>
+        </w:rPr>
+        <w:t xml:space="preserve">403</w:t>
+      </w:r>
+      <w:r>
+        <w:t xml:space="preserve"> </w:t>
+      </w:r>
+      <w:r>
+        <w:t xml:space="preserve">when token is invalid/verification fails</w:t>
       </w:r>
     </w:p>
     <w:bookmarkEnd w:id="62"/>
@@ -4707,7 +5276,7 @@
       <w:pPr>
         <w:numPr>
           <w:ilvl w:val="0"/>
-          <w:numId w:val="1047"/>
+          <w:numId w:val="1049"/>
         </w:numPr>
         <w:pStyle w:val="Compact"/>
       </w:pPr>
@@ -4719,7 +5288,7 @@
       <w:pPr>
         <w:numPr>
           <w:ilvl w:val="0"/>
-          <w:numId w:val="1047"/>
+          <w:numId w:val="1049"/>
         </w:numPr>
         <w:pStyle w:val="Compact"/>
       </w:pPr>
@@ -4741,7 +5310,7 @@
       <w:pPr>
         <w:numPr>
           <w:ilvl w:val="0"/>
-          <w:numId w:val="1048"/>
+          <w:numId w:val="1050"/>
         </w:numPr>
         <w:pStyle w:val="Compact"/>
       </w:pPr>
@@ -4768,7 +5337,7 @@
       <w:pPr>
         <w:numPr>
           <w:ilvl w:val="0"/>
-          <w:numId w:val="1048"/>
+          <w:numId w:val="1050"/>
         </w:numPr>
         <w:pStyle w:val="Compact"/>
       </w:pPr>
@@ -4780,7 +5349,7 @@
       <w:pPr>
         <w:numPr>
           <w:ilvl w:val="0"/>
-          <w:numId w:val="1048"/>
+          <w:numId w:val="1050"/>
         </w:numPr>
         <w:pStyle w:val="Compact"/>
       </w:pPr>
@@ -4797,7 +5366,7 @@
     </w:p>
     <w:bookmarkEnd w:id="64"/>
     <w:bookmarkEnd w:id="65"/>
-    <w:bookmarkStart w:id="68" w:name="X135cda126bc3bb6426e45f076c3e3a1689333b0"/>
+    <w:bookmarkStart w:id="72" w:name="X135cda126bc3bb6426e45f076c3e3a1689333b0"/>
     <w:p>
       <w:pPr>
         <w:pStyle w:val="Heading2"/>
@@ -4818,7 +5387,7 @@
       <w:pPr>
         <w:numPr>
           <w:ilvl w:val="0"/>
-          <w:numId w:val="1049"/>
+          <w:numId w:val="1051"/>
         </w:numPr>
         <w:pStyle w:val="Compact"/>
       </w:pPr>
@@ -4854,7 +5423,7 @@
       <w:pPr>
         <w:numPr>
           <w:ilvl w:val="0"/>
-          <w:numId w:val="1049"/>
+          <w:numId w:val="1051"/>
         </w:numPr>
         <w:pStyle w:val="Compact"/>
       </w:pPr>
@@ -4899,7 +5468,7 @@
       <w:pPr>
         <w:numPr>
           <w:ilvl w:val="0"/>
-          <w:numId w:val="1050"/>
+          <w:numId w:val="1052"/>
         </w:numPr>
         <w:pStyle w:val="Compact"/>
       </w:pPr>
@@ -4911,7 +5480,7 @@
       <w:pPr>
         <w:numPr>
           <w:ilvl w:val="0"/>
-          <w:numId w:val="1050"/>
+          <w:numId w:val="1052"/>
         </w:numPr>
         <w:pStyle w:val="Compact"/>
       </w:pPr>
@@ -4923,7 +5492,7 @@
       <w:pPr>
         <w:numPr>
           <w:ilvl w:val="0"/>
-          <w:numId w:val="1050"/>
+          <w:numId w:val="1052"/>
         </w:numPr>
         <w:pStyle w:val="Compact"/>
       </w:pPr>
@@ -4932,12 +5501,475 @@
       </w:r>
     </w:p>
     <w:bookmarkEnd w:id="66"/>
-    <w:bookmarkStart w:id="67" w:name="contract-mismatch-to-note"/>
+    <w:bookmarkStart w:id="67" w:name="db-implementation-stream-fork-reference"/>
     <w:p>
       <w:pPr>
         <w:pStyle w:val="Heading3"/>
       </w:pPr>
       <w:r>
+        <w:t xml:space="preserve">9.1.1 DB implementation stream (fork reference)</w:t>
+      </w:r>
+    </w:p>
+    <w:p>
+      <w:pPr>
+        <w:numPr>
+          <w:ilvl w:val="0"/>
+          <w:numId w:val="1053"/>
+        </w:numPr>
+        <w:pStyle w:val="Compact"/>
+      </w:pPr>
+      <w:r>
+        <w:t xml:space="preserve">External fork commit history (</w:t>
+      </w:r>
+      <w:r>
+        <w:rPr>
+          <w:rStyle w:val="VerbatimChar"/>
+        </w:rPr>
+        <w:t xml:space="preserve">FarrisBaboo/main</w:t>
+      </w:r>
+      <w:r>
+        <w:t xml:space="preserve">) shows a DB-first implementation stream with ingestion and endpoint updates:</w:t>
+      </w:r>
+    </w:p>
+    <w:p>
+      <w:pPr>
+        <w:numPr>
+          <w:ilvl w:val="1"/>
+          <w:numId w:val="1054"/>
+        </w:numPr>
+        <w:pStyle w:val="Compact"/>
+      </w:pPr>
+      <w:r>
+        <w:rPr>
+          <w:rStyle w:val="VerbatimChar"/>
+        </w:rPr>
+        <w:t xml:space="preserve">5e04d8e</w:t>
+      </w:r>
+      <w:r>
+        <w:t xml:space="preserve"> </w:t>
+      </w:r>
+      <w:r>
+        <w:t xml:space="preserve">ingestion logic + models</w:t>
+      </w:r>
+    </w:p>
+    <w:p>
+      <w:pPr>
+        <w:numPr>
+          <w:ilvl w:val="1"/>
+          <w:numId w:val="1054"/>
+        </w:numPr>
+        <w:pStyle w:val="Compact"/>
+      </w:pPr>
+      <w:r>
+        <w:rPr>
+          <w:rStyle w:val="VerbatimChar"/>
+        </w:rPr>
+        <w:t xml:space="preserve">89e7d28</w:t>
+      </w:r>
+      <w:r>
+        <w:t xml:space="preserve"> </w:t>
+      </w:r>
+      <w:r>
+        <w:t xml:space="preserve">DB controllers/service/repository + ingest fix</w:t>
+      </w:r>
+    </w:p>
+    <w:p>
+      <w:pPr>
+        <w:numPr>
+          <w:ilvl w:val="1"/>
+          <w:numId w:val="1054"/>
+        </w:numPr>
+        <w:pStyle w:val="Compact"/>
+      </w:pPr>
+      <w:r>
+        <w:rPr>
+          <w:rStyle w:val="VerbatimChar"/>
+        </w:rPr>
+        <w:t xml:space="preserve">bffcaba</w:t>
+      </w:r>
+      <w:r>
+        <w:t xml:space="preserve"> </w:t>
+      </w:r>
+      <w:r>
+        <w:t xml:space="preserve">mock-to-DB connection fix</w:t>
+      </w:r>
+    </w:p>
+    <w:p>
+      <w:pPr>
+        <w:numPr>
+          <w:ilvl w:val="1"/>
+          <w:numId w:val="1054"/>
+        </w:numPr>
+        <w:pStyle w:val="Compact"/>
+      </w:pPr>
+      <w:r>
+        <w:rPr>
+          <w:rStyle w:val="VerbatimChar"/>
+        </w:rPr>
+        <w:t xml:space="preserve">c92a28f</w:t>
+      </w:r>
+      <w:r>
+        <w:t xml:space="preserve"> </w:t>
+      </w:r>
+      <w:r>
+        <w:t xml:space="preserve">ingestion pipeline and dataset/series endpoint update</w:t>
+      </w:r>
+    </w:p>
+    <w:p>
+      <w:pPr>
+        <w:pStyle w:val="FirstParagraph"/>
+      </w:pPr>
+      <w:r>
+        <w:t xml:space="preserve">Low-level implication:</w:t>
+      </w:r>
+    </w:p>
+    <w:p>
+      <w:pPr>
+        <w:numPr>
+          <w:ilvl w:val="0"/>
+          <w:numId w:val="1055"/>
+        </w:numPr>
+        <w:pStyle w:val="Compact"/>
+      </w:pPr>
+      <w:r>
+        <w:t xml:space="preserve">LLD should model two repository strategies:</w:t>
+      </w:r>
+    </w:p>
+    <w:p>
+      <w:pPr>
+        <w:numPr>
+          <w:ilvl w:val="1"/>
+          <w:numId w:val="1056"/>
+        </w:numPr>
+        <w:pStyle w:val="Compact"/>
+      </w:pPr>
+      <w:r>
+        <w:rPr>
+          <w:rStyle w:val="VerbatimChar"/>
+        </w:rPr>
+        <w:t xml:space="preserve">FileRepository</w:t>
+      </w:r>
+      <w:r>
+        <w:t xml:space="preserve"> </w:t>
+      </w:r>
+      <w:r>
+        <w:t xml:space="preserve">(current local runtime in this workspace)</w:t>
+      </w:r>
+    </w:p>
+    <w:p>
+      <w:pPr>
+        <w:numPr>
+          <w:ilvl w:val="1"/>
+          <w:numId w:val="1056"/>
+        </w:numPr>
+        <w:pStyle w:val="Compact"/>
+      </w:pPr>
+      <w:r>
+        <w:rPr>
+          <w:rStyle w:val="VerbatimChar"/>
+        </w:rPr>
+        <w:t xml:space="preserve">DbRepository</w:t>
+      </w:r>
+      <w:r>
+        <w:t xml:space="preserve"> </w:t>
+      </w:r>
+      <w:r>
+        <w:t xml:space="preserve">(integration path demonstrated in DB stream)</w:t>
+      </w:r>
+    </w:p>
+    <w:p>
+      <w:pPr>
+        <w:numPr>
+          <w:ilvl w:val="0"/>
+          <w:numId w:val="1055"/>
+        </w:numPr>
+        <w:pStyle w:val="Compact"/>
+      </w:pPr>
+      <w:r>
+        <w:t xml:space="preserve">Controller/service contracts should remain stable so repository implementation can be swapped without route-level refactor.</w:t>
+      </w:r>
+    </w:p>
+    <w:bookmarkEnd w:id="67"/>
+    <w:bookmarkStart w:id="68" w:name="backend-auth-stream-note-pr-70"/>
+    <w:p>
+      <w:pPr>
+        <w:pStyle w:val="Heading3"/>
+      </w:pPr>
+      <w:r>
+        <w:t xml:space="preserve">9.4 Backend auth stream note (PR #70)</w:t>
+      </w:r>
+    </w:p>
+    <w:p>
+      <w:pPr>
+        <w:numPr>
+          <w:ilvl w:val="0"/>
+          <w:numId w:val="1057"/>
+        </w:numPr>
+        <w:pStyle w:val="Compact"/>
+      </w:pPr>
+      <w:r>
+        <w:t xml:space="preserve">Merged backend PR adds lightweight authentication primitives (bcrypt, JWT, middleware) to the Node codebase lineage.</w:t>
+      </w:r>
+    </w:p>
+    <w:p>
+      <w:pPr>
+        <w:numPr>
+          <w:ilvl w:val="0"/>
+          <w:numId w:val="1057"/>
+        </w:numPr>
+        <w:pStyle w:val="Compact"/>
+      </w:pPr>
+      <w:r>
+        <w:t xml:space="preserve">LLD implication: endpoint contracts should now classify routes as</w:t>
+      </w:r>
+      <w:r>
+        <w:t xml:space="preserve"> </w:t>
+      </w:r>
+      <w:r>
+        <w:rPr>
+          <w:rStyle w:val="VerbatimChar"/>
+        </w:rPr>
+        <w:t xml:space="preserve">public</w:t>
+      </w:r>
+      <w:r>
+        <w:t xml:space="preserve"> </w:t>
+      </w:r>
+      <w:r>
+        <w:t xml:space="preserve">vs</w:t>
+      </w:r>
+      <w:r>
+        <w:t xml:space="preserve"> </w:t>
+      </w:r>
+      <w:r>
+        <w:rPr>
+          <w:rStyle w:val="VerbatimChar"/>
+        </w:rPr>
+        <w:t xml:space="preserve">protected</w:t>
+      </w:r>
+      <w:r>
+        <w:t xml:space="preserve"> </w:t>
+      </w:r>
+      <w:r>
+        <w:t xml:space="preserve">and enforce</w:t>
+      </w:r>
+      <w:r>
+        <w:t xml:space="preserve"> </w:t>
+      </w:r>
+      <w:r>
+        <w:rPr>
+          <w:rStyle w:val="VerbatimChar"/>
+        </w:rPr>
+        <w:t xml:space="preserve">Authorization: Bearer &lt;token&gt;</w:t>
+      </w:r>
+      <w:r>
+        <w:t xml:space="preserve"> </w:t>
+      </w:r>
+      <w:r>
+        <w:t xml:space="preserve">on protected operations.</w:t>
+      </w:r>
+    </w:p>
+    <w:p>
+      <w:pPr>
+        <w:numPr>
+          <w:ilvl w:val="0"/>
+          <w:numId w:val="1057"/>
+        </w:numPr>
+        <w:pStyle w:val="Compact"/>
+      </w:pPr>
+      <w:r>
+        <w:t xml:space="preserve">Integration step pending: align frontend auth client calls with backend token issuance/verification endpoints and standardized error payloads.</w:t>
+      </w:r>
+    </w:p>
+    <w:bookmarkEnd w:id="68"/>
+    <w:bookmarkStart w:id="69" w:name="data-science-stream-note-fork-reference"/>
+    <w:p>
+      <w:pPr>
+        <w:pStyle w:val="Heading3"/>
+      </w:pPr>
+      <w:r>
+        <w:t xml:space="preserve">9.5 Data science stream note (fork reference)</w:t>
+      </w:r>
+    </w:p>
+    <w:p>
+      <w:pPr>
+        <w:numPr>
+          <w:ilvl w:val="0"/>
+          <w:numId w:val="1058"/>
+        </w:numPr>
+        <w:pStyle w:val="Compact"/>
+      </w:pPr>
+      <w:r>
+        <w:t xml:space="preserve">External DS fork reference:</w:t>
+      </w:r>
+      <w:r>
+        <w:t xml:space="preserve"> </w:t>
+      </w:r>
+      <w:r>
+        <w:rPr>
+          <w:rStyle w:val="VerbatimChar"/>
+        </w:rPr>
+        <w:t xml:space="preserve">https://github.com/Yashdeep22/Intelligent-IoT-Data-Management</w:t>
+      </w:r>
+    </w:p>
+    <w:p>
+      <w:pPr>
+        <w:numPr>
+          <w:ilvl w:val="0"/>
+          <w:numId w:val="1058"/>
+        </w:numPr>
+        <w:pStyle w:val="Compact"/>
+      </w:pPr>
+      <w:r>
+        <w:t xml:space="preserve">Commit trail indicates a richer detector and benchmarking pipeline, including:</w:t>
+      </w:r>
+    </w:p>
+    <w:p>
+      <w:pPr>
+        <w:numPr>
+          <w:ilvl w:val="1"/>
+          <w:numId w:val="1059"/>
+        </w:numPr>
+        <w:pStyle w:val="Compact"/>
+      </w:pPr>
+      <w:r>
+        <w:t xml:space="preserve">ThresholdAD (</w:t>
+      </w:r>
+      <w:r>
+        <w:rPr>
+          <w:rStyle w:val="VerbatimChar"/>
+        </w:rPr>
+        <w:t xml:space="preserve">2ead71a</w:t>
+      </w:r>
+      <w:r>
+        <w:t xml:space="preserve">)</w:t>
+      </w:r>
+    </w:p>
+    <w:p>
+      <w:pPr>
+        <w:numPr>
+          <w:ilvl w:val="1"/>
+          <w:numId w:val="1059"/>
+        </w:numPr>
+        <w:pStyle w:val="Compact"/>
+      </w:pPr>
+      <w:r>
+        <w:t xml:space="preserve">LOF detector + edge guard (</w:t>
+      </w:r>
+      <w:r>
+        <w:rPr>
+          <w:rStyle w:val="VerbatimChar"/>
+        </w:rPr>
+        <w:t xml:space="preserve">2707a31</w:t>
+      </w:r>
+      <w:r>
+        <w:t xml:space="preserve">,</w:t>
+      </w:r>
+      <w:r>
+        <w:t xml:space="preserve"> </w:t>
+      </w:r>
+      <w:r>
+        <w:rPr>
+          <w:rStyle w:val="VerbatimChar"/>
+        </w:rPr>
+        <w:t xml:space="preserve">a67ac40</w:t>
+      </w:r>
+      <w:r>
+        <w:t xml:space="preserve">)</w:t>
+      </w:r>
+    </w:p>
+    <w:p>
+      <w:pPr>
+        <w:numPr>
+          <w:ilvl w:val="1"/>
+          <w:numId w:val="1059"/>
+        </w:numPr>
+        <w:pStyle w:val="Compact"/>
+      </w:pPr>
+      <w:r>
+        <w:t xml:space="preserve">benchmark label handling and NAB support (</w:t>
+      </w:r>
+      <w:r>
+        <w:rPr>
+          <w:rStyle w:val="VerbatimChar"/>
+        </w:rPr>
+        <w:t xml:space="preserve">6d21e24</w:t>
+      </w:r>
+      <w:r>
+        <w:t xml:space="preserve">,</w:t>
+      </w:r>
+      <w:r>
+        <w:t xml:space="preserve"> </w:t>
+      </w:r>
+      <w:r>
+        <w:rPr>
+          <w:rStyle w:val="VerbatimChar"/>
+        </w:rPr>
+        <w:t xml:space="preserve">f31fad3</w:t>
+      </w:r>
+      <w:r>
+        <w:t xml:space="preserve">)</w:t>
+      </w:r>
+    </w:p>
+    <w:p>
+      <w:pPr>
+        <w:numPr>
+          <w:ilvl w:val="1"/>
+          <w:numId w:val="1059"/>
+        </w:numPr>
+        <w:pStyle w:val="Compact"/>
+      </w:pPr>
+      <w:r>
+        <w:t xml:space="preserve">combined benchmark reporting (</w:t>
+      </w:r>
+      <w:r>
+        <w:rPr>
+          <w:rStyle w:val="VerbatimChar"/>
+        </w:rPr>
+        <w:t xml:space="preserve">7ab182b</w:t>
+      </w:r>
+      <w:r>
+        <w:t xml:space="preserve">)</w:t>
+      </w:r>
+    </w:p>
+    <w:p>
+      <w:pPr>
+        <w:pStyle w:val="FirstParagraph"/>
+      </w:pPr>
+      <w:r>
+        <w:t xml:space="preserve">Low-level implication:</w:t>
+      </w:r>
+    </w:p>
+    <w:p>
+      <w:pPr>
+        <w:numPr>
+          <w:ilvl w:val="0"/>
+          <w:numId w:val="1060"/>
+        </w:numPr>
+        <w:pStyle w:val="Compact"/>
+      </w:pPr>
+      <w:r>
+        <w:t xml:space="preserve">Keep analytics adapters behind a stable detector interface (fit/score/predict contract) so detector substitution does not affect API shape.</w:t>
+      </w:r>
+    </w:p>
+    <w:p>
+      <w:pPr>
+        <w:numPr>
+          <w:ilvl w:val="0"/>
+          <w:numId w:val="1060"/>
+        </w:numPr>
+        <w:pStyle w:val="Compact"/>
+      </w:pPr>
+      <w:r>
+        <w:t xml:space="preserve">Treat benchmark/report scripts as offline evaluation modules and avoid coupling them to request/response critical path.</w:t>
+      </w:r>
+    </w:p>
+    <w:bookmarkEnd w:id="69"/>
+    <w:bookmarkStart w:id="70" w:name="contract-mismatch-to-note"/>
+    <w:p>
+      <w:pPr>
+        <w:pStyle w:val="Heading3"/>
+      </w:pPr>
+      <w:r>
         <w:t xml:space="preserve">9.2 Contract mismatch to note</w:t>
       </w:r>
     </w:p>
@@ -4945,7 +5977,7 @@
       <w:pPr>
         <w:numPr>
           <w:ilvl w:val="0"/>
-          <w:numId w:val="1051"/>
+          <w:numId w:val="1061"/>
         </w:numPr>
         <w:pStyle w:val="Compact"/>
       </w:pPr>
@@ -4975,7 +6007,7 @@
       <w:pPr>
         <w:numPr>
           <w:ilvl w:val="0"/>
-          <w:numId w:val="1051"/>
+          <w:numId w:val="1061"/>
         </w:numPr>
         <w:pStyle w:val="Compact"/>
       </w:pPr>
@@ -5017,12 +6049,145 @@
       <w:pPr>
         <w:numPr>
           <w:ilvl w:val="0"/>
-          <w:numId w:val="1051"/>
+          <w:numId w:val="1061"/>
         </w:numPr>
         <w:pStyle w:val="Compact"/>
       </w:pPr>
       <w:r>
         <w:t xml:space="preserve">Flask expects multipart form-data with file upload, while frontend currently sends JSON</w:t>
+      </w:r>
+    </w:p>
+    <w:bookmarkEnd w:id="70"/>
+    <w:bookmarkStart w:id="71" w:name="additional-frontend-track-note"/>
+    <w:p>
+      <w:pPr>
+        <w:pStyle w:val="Heading3"/>
+      </w:pPr>
+      <w:r>
+        <w:t xml:space="preserve">9.3 Additional frontend track note</w:t>
+      </w:r>
+    </w:p>
+    <w:p>
+      <w:pPr>
+        <w:numPr>
+          <w:ilvl w:val="0"/>
+          <w:numId w:val="1062"/>
+        </w:numPr>
+        <w:pStyle w:val="Compact"/>
+      </w:pPr>
+      <w:r>
+        <w:rPr>
+          <w:rStyle w:val="VerbatimChar"/>
+        </w:rPr>
+        <w:t xml:space="preserve">frontend/src/App.jsx</w:t>
+      </w:r>
+      <w:r>
+        <w:t xml:space="preserve"> </w:t>
+      </w:r>
+      <w:r>
+        <w:t xml:space="preserve">includes</w:t>
+      </w:r>
+      <w:r>
+        <w:t xml:space="preserve"> </w:t>
+      </w:r>
+      <w:r>
+        <w:rPr>
+          <w:rStyle w:val="VerbatimChar"/>
+        </w:rPr>
+        <w:t xml:space="preserve">Login</w:t>
+      </w:r>
+      <w:r>
+        <w:t xml:space="preserve">,</w:t>
+      </w:r>
+      <w:r>
+        <w:t xml:space="preserve"> </w:t>
+      </w:r>
+      <w:r>
+        <w:rPr>
+          <w:rStyle w:val="VerbatimChar"/>
+        </w:rPr>
+        <w:t xml:space="preserve">Register</w:t>
+      </w:r>
+      <w:r>
+        <w:t xml:space="preserve">, and</w:t>
+      </w:r>
+      <w:r>
+        <w:t xml:space="preserve"> </w:t>
+      </w:r>
+      <w:r>
+        <w:rPr>
+          <w:rStyle w:val="VerbatimChar"/>
+        </w:rPr>
+        <w:t xml:space="preserve">AnalyzePanel</w:t>
+      </w:r>
+      <w:r>
+        <w:t xml:space="preserve"> </w:t>
+      </w:r>
+      <w:r>
+        <w:t xml:space="preserve">routes and MUI-based theme switching.</w:t>
+      </w:r>
+    </w:p>
+    <w:p>
+      <w:pPr>
+        <w:numPr>
+          <w:ilvl w:val="0"/>
+          <w:numId w:val="1062"/>
+        </w:numPr>
+        <w:pStyle w:val="Compact"/>
+      </w:pPr>
+      <w:r>
+        <w:rPr>
+          <w:rStyle w:val="VerbatimChar"/>
+        </w:rPr>
+        <w:t xml:space="preserve">new-frontend/frontend</w:t>
+      </w:r>
+      <w:r>
+        <w:t xml:space="preserve"> </w:t>
+      </w:r>
+      <w:r>
+        <w:t xml:space="preserve">now also includes a full auth + protected-layout route structure after PR #71.</w:t>
+      </w:r>
+    </w:p>
+    <w:p>
+      <w:pPr>
+        <w:numPr>
+          <w:ilvl w:val="0"/>
+          <w:numId w:val="1062"/>
+        </w:numPr>
+        <w:pStyle w:val="Compact"/>
+      </w:pPr>
+      <w:r>
+        <w:t xml:space="preserve">For convergence, keep</w:t>
+      </w:r>
+      <w:r>
+        <w:t xml:space="preserve"> </w:t>
+      </w:r>
+      <w:r>
+        <w:rPr>
+          <w:rStyle w:val="VerbatimChar"/>
+        </w:rPr>
+        <w:t xml:space="preserve">new-frontend/frontend</w:t>
+      </w:r>
+      <w:r>
+        <w:t xml:space="preserve"> </w:t>
+      </w:r>
+      <w:r>
+        <w:t xml:space="preserve">as primary runtime UI path and treat</w:t>
+      </w:r>
+      <w:r>
+        <w:t xml:space="preserve"> </w:t>
+      </w:r>
+      <w:r>
+        <w:rPr>
+          <w:rStyle w:val="VerbatimChar"/>
+        </w:rPr>
+        <w:t xml:space="preserve">frontend</w:t>
+      </w:r>
+      <w:r>
+        <w:t xml:space="preserve"> </w:t>
+      </w:r>
+      <w:r>
+        <w:t xml:space="preserve">as adjacent/legacy path unless team explicitly consolidates.</w:t>
       </w:r>
     </w:p>
     <w:p>
@@ -5032,9 +6197,9 @@
         </w:pict>
       </w:r>
     </w:p>
-    <w:bookmarkEnd w:id="67"/>
-    <w:bookmarkEnd w:id="68"/>
-    <w:bookmarkStart w:id="72" w:name="testing-strategy-low-level"/>
+    <w:bookmarkEnd w:id="71"/>
+    <w:bookmarkEnd w:id="72"/>
+    <w:bookmarkStart w:id="76" w:name="testing-strategy-low-level"/>
     <w:p>
       <w:pPr>
         <w:pStyle w:val="Heading2"/>
@@ -5043,7 +6208,7 @@
         <w:t xml:space="preserve">10. Testing Strategy (Low-Level)</w:t>
       </w:r>
     </w:p>
-    <w:bookmarkStart w:id="69" w:name="backend-unitintegration-tests"/>
+    <w:bookmarkStart w:id="73" w:name="backend-unitintegration-tests"/>
     <w:p>
       <w:pPr>
         <w:pStyle w:val="Heading3"/>
@@ -5056,7 +6221,7 @@
       <w:pPr>
         <w:numPr>
           <w:ilvl w:val="0"/>
-          <w:numId w:val="1052"/>
+          <w:numId w:val="1063"/>
         </w:numPr>
         <w:pStyle w:val="Compact"/>
       </w:pPr>
@@ -5068,7 +6233,7 @@
       <w:pPr>
         <w:numPr>
           <w:ilvl w:val="1"/>
-          <w:numId w:val="1053"/>
+          <w:numId w:val="1064"/>
         </w:numPr>
         <w:pStyle w:val="Compact"/>
       </w:pPr>
@@ -5080,7 +6245,7 @@
       <w:pPr>
         <w:numPr>
           <w:ilvl w:val="1"/>
-          <w:numId w:val="1053"/>
+          <w:numId w:val="1064"/>
         </w:numPr>
         <w:pStyle w:val="Compact"/>
       </w:pPr>
@@ -5092,7 +6257,7 @@
       <w:pPr>
         <w:numPr>
           <w:ilvl w:val="0"/>
-          <w:numId w:val="1052"/>
+          <w:numId w:val="1063"/>
         </w:numPr>
         <w:pStyle w:val="Compact"/>
       </w:pPr>
@@ -5104,7 +6269,7 @@
       <w:pPr>
         <w:numPr>
           <w:ilvl w:val="1"/>
-          <w:numId w:val="1054"/>
+          <w:numId w:val="1065"/>
         </w:numPr>
         <w:pStyle w:val="Compact"/>
       </w:pPr>
@@ -5116,7 +6281,7 @@
       <w:pPr>
         <w:numPr>
           <w:ilvl w:val="1"/>
-          <w:numId w:val="1054"/>
+          <w:numId w:val="1065"/>
         </w:numPr>
         <w:pStyle w:val="Compact"/>
       </w:pPr>
@@ -5128,7 +6293,7 @@
       <w:pPr>
         <w:numPr>
           <w:ilvl w:val="0"/>
-          <w:numId w:val="1052"/>
+          <w:numId w:val="1063"/>
         </w:numPr>
         <w:pStyle w:val="Compact"/>
       </w:pPr>
@@ -5140,7 +6305,7 @@
       <w:pPr>
         <w:numPr>
           <w:ilvl w:val="1"/>
-          <w:numId w:val="1055"/>
+          <w:numId w:val="1066"/>
         </w:numPr>
         <w:pStyle w:val="Compact"/>
       </w:pPr>
@@ -5176,7 +6341,7 @@
       <w:pPr>
         <w:numPr>
           <w:ilvl w:val="1"/>
-          <w:numId w:val="1055"/>
+          <w:numId w:val="1066"/>
         </w:numPr>
         <w:pStyle w:val="Compact"/>
       </w:pPr>
@@ -5212,7 +6377,7 @@
       <w:pPr>
         <w:numPr>
           <w:ilvl w:val="1"/>
-          <w:numId w:val="1055"/>
+          <w:numId w:val="1066"/>
         </w:numPr>
         <w:pStyle w:val="Compact"/>
       </w:pPr>
@@ -5248,7 +6413,7 @@
       <w:pPr>
         <w:numPr>
           <w:ilvl w:val="1"/>
-          <w:numId w:val="1055"/>
+          <w:numId w:val="1066"/>
         </w:numPr>
         <w:pStyle w:val="Compact"/>
       </w:pPr>
@@ -5278,7 +6443,7 @@
       <w:pPr>
         <w:numPr>
           <w:ilvl w:val="1"/>
-          <w:numId w:val="1055"/>
+          <w:numId w:val="1066"/>
         </w:numPr>
         <w:pStyle w:val="Compact"/>
       </w:pPr>
@@ -5314,7 +6479,7 @@
       <w:pPr>
         <w:numPr>
           <w:ilvl w:val="1"/>
-          <w:numId w:val="1055"/>
+          <w:numId w:val="1066"/>
         </w:numPr>
         <w:pStyle w:val="Compact"/>
       </w:pPr>
@@ -5344,7 +6509,7 @@
       <w:pPr>
         <w:numPr>
           <w:ilvl w:val="1"/>
-          <w:numId w:val="1055"/>
+          <w:numId w:val="1066"/>
         </w:numPr>
         <w:pStyle w:val="Compact"/>
       </w:pPr>
@@ -5370,8 +6535,8 @@
         <w:t xml:space="preserve">400</w:t>
       </w:r>
     </w:p>
-    <w:bookmarkEnd w:id="69"/>
-    <w:bookmarkStart w:id="70" w:name="frontend-tests"/>
+    <w:bookmarkEnd w:id="73"/>
+    <w:bookmarkStart w:id="74" w:name="frontend-tests"/>
     <w:p>
       <w:pPr>
         <w:pStyle w:val="Heading3"/>
@@ -5384,7 +6549,7 @@
       <w:pPr>
         <w:numPr>
           <w:ilvl w:val="0"/>
-          <w:numId w:val="1056"/>
+          <w:numId w:val="1067"/>
         </w:numPr>
         <w:pStyle w:val="Compact"/>
       </w:pPr>
@@ -5396,7 +6561,7 @@
       <w:pPr>
         <w:numPr>
           <w:ilvl w:val="1"/>
-          <w:numId w:val="1057"/>
+          <w:numId w:val="1068"/>
         </w:numPr>
         <w:pStyle w:val="Compact"/>
       </w:pPr>
@@ -5417,7 +6582,7 @@
       <w:pPr>
         <w:numPr>
           <w:ilvl w:val="1"/>
-          <w:numId w:val="1057"/>
+          <w:numId w:val="1068"/>
         </w:numPr>
         <w:pStyle w:val="Compact"/>
       </w:pPr>
@@ -5438,7 +6603,7 @@
       <w:pPr>
         <w:numPr>
           <w:ilvl w:val="0"/>
-          <w:numId w:val="1056"/>
+          <w:numId w:val="1067"/>
         </w:numPr>
         <w:pStyle w:val="Compact"/>
       </w:pPr>
@@ -5450,7 +6615,7 @@
       <w:pPr>
         <w:numPr>
           <w:ilvl w:val="1"/>
-          <w:numId w:val="1058"/>
+          <w:numId w:val="1069"/>
         </w:numPr>
         <w:pStyle w:val="Compact"/>
       </w:pPr>
@@ -5462,7 +6627,7 @@
       <w:pPr>
         <w:numPr>
           <w:ilvl w:val="1"/>
-          <w:numId w:val="1058"/>
+          <w:numId w:val="1069"/>
         </w:numPr>
         <w:pStyle w:val="Compact"/>
       </w:pPr>
@@ -5474,7 +6639,7 @@
       <w:pPr>
         <w:numPr>
           <w:ilvl w:val="1"/>
-          <w:numId w:val="1058"/>
+          <w:numId w:val="1069"/>
         </w:numPr>
         <w:pStyle w:val="Compact"/>
       </w:pPr>
@@ -5486,7 +6651,7 @@
       <w:pPr>
         <w:numPr>
           <w:ilvl w:val="0"/>
-          <w:numId w:val="1056"/>
+          <w:numId w:val="1067"/>
         </w:numPr>
         <w:pStyle w:val="Compact"/>
       </w:pPr>
@@ -5498,7 +6663,7 @@
       <w:pPr>
         <w:numPr>
           <w:ilvl w:val="1"/>
-          <w:numId w:val="1059"/>
+          <w:numId w:val="1070"/>
         </w:numPr>
         <w:pStyle w:val="Compact"/>
       </w:pPr>
@@ -5506,8 +6671,8 @@
         <w:t xml:space="preserve">dashboard conditionally renders sections by stream count</w:t>
       </w:r>
     </w:p>
-    <w:bookmarkEnd w:id="70"/>
-    <w:bookmarkStart w:id="71" w:name="suggested-tooling"/>
+    <w:bookmarkEnd w:id="74"/>
+    <w:bookmarkStart w:id="75" w:name="suggested-tooling"/>
     <w:p>
       <w:pPr>
         <w:pStyle w:val="Heading3"/>
@@ -5520,7 +6685,7 @@
       <w:pPr>
         <w:numPr>
           <w:ilvl w:val="0"/>
-          <w:numId w:val="1060"/>
+          <w:numId w:val="1071"/>
         </w:numPr>
         <w:pStyle w:val="Compact"/>
       </w:pPr>
@@ -5556,7 +6721,7 @@
       <w:pPr>
         <w:numPr>
           <w:ilvl w:val="0"/>
-          <w:numId w:val="1060"/>
+          <w:numId w:val="1071"/>
         </w:numPr>
         <w:pStyle w:val="Compact"/>
       </w:pPr>
@@ -5586,6 +6751,33 @@
           <w:rStyle w:val="VerbatimChar"/>
         </w:rPr>
         <w:t xml:space="preserve">@testing-library/react</w:t>
+      </w:r>
+    </w:p>
+    <w:p>
+      <w:pPr>
+        <w:numPr>
+          <w:ilvl w:val="0"/>
+          <w:numId w:val="1071"/>
+        </w:numPr>
+        <w:pStyle w:val="Compact"/>
+      </w:pPr>
+      <w:r>
+        <w:t xml:space="preserve">Data science:</w:t>
+      </w:r>
+      <w:r>
+        <w:t xml:space="preserve"> </w:t>
+      </w:r>
+      <w:r>
+        <w:rPr>
+          <w:rStyle w:val="VerbatimChar"/>
+        </w:rPr>
+        <w:t xml:space="preserve">pytest</w:t>
+      </w:r>
+      <w:r>
+        <w:t xml:space="preserve"> </w:t>
+      </w:r>
+      <w:r>
+        <w:t xml:space="preserve">+ fixture-based benchmark regression checks</w:t>
       </w:r>
     </w:p>
     <w:p>
@@ -5595,9 +6787,9 @@
         </w:pict>
       </w:r>
     </w:p>
-    <w:bookmarkEnd w:id="71"/>
-    <w:bookmarkEnd w:id="72"/>
-    <w:bookmarkStart w:id="73" w:name="performance-and-scaling-notes"/>
+    <w:bookmarkEnd w:id="75"/>
+    <w:bookmarkEnd w:id="76"/>
+    <w:bookmarkStart w:id="77" w:name="performance-and-scaling-notes"/>
     <w:p>
       <w:pPr>
         <w:pStyle w:val="Heading2"/>
@@ -5610,7 +6802,7 @@
       <w:pPr>
         <w:numPr>
           <w:ilvl w:val="0"/>
-          <w:numId w:val="1061"/>
+          <w:numId w:val="1072"/>
         </w:numPr>
         <w:pStyle w:val="Compact"/>
       </w:pPr>
@@ -5622,7 +6814,7 @@
       <w:pPr>
         <w:numPr>
           <w:ilvl w:val="0"/>
-          <w:numId w:val="1061"/>
+          <w:numId w:val="1072"/>
         </w:numPr>
         <w:pStyle w:val="Compact"/>
       </w:pPr>
@@ -5634,7 +6826,7 @@
       <w:pPr>
         <w:numPr>
           <w:ilvl w:val="0"/>
-          <w:numId w:val="1061"/>
+          <w:numId w:val="1072"/>
         </w:numPr>
         <w:pStyle w:val="Compact"/>
       </w:pPr>
@@ -5667,7 +6859,7 @@
       <w:pPr>
         <w:numPr>
           <w:ilvl w:val="0"/>
-          <w:numId w:val="1061"/>
+          <w:numId w:val="1072"/>
         </w:numPr>
         <w:pStyle w:val="Compact"/>
       </w:pPr>
@@ -5682,8 +6874,8 @@
         </w:pict>
       </w:r>
     </w:p>
-    <w:bookmarkEnd w:id="73"/>
-    <w:bookmarkStart w:id="76" w:name="runbook-developer"/>
+    <w:bookmarkEnd w:id="77"/>
+    <w:bookmarkStart w:id="80" w:name="runbook-developer"/>
     <w:p>
       <w:pPr>
         <w:pStyle w:val="Heading2"/>
@@ -5692,7 +6884,7 @@
         <w:t xml:space="preserve">12. Runbook (Developer)</w:t>
       </w:r>
     </w:p>
-    <w:bookmarkStart w:id="74" w:name="primary-converged-path"/>
+    <w:bookmarkStart w:id="78" w:name="primary-converged-path"/>
     <w:p>
       <w:pPr>
         <w:pStyle w:val="Heading3"/>
@@ -5826,8 +7018,8 @@
         <w:t xml:space="preserve"> run dev</w:t>
       </w:r>
     </w:p>
-    <w:bookmarkEnd w:id="74"/>
-    <w:bookmarkStart w:id="75" w:name="optional-analytics-path"/>
+    <w:bookmarkEnd w:id="78"/>
+    <w:bookmarkStart w:id="79" w:name="optional-analytics-path"/>
     <w:p>
       <w:pPr>
         <w:pStyle w:val="Heading3"/>
@@ -5917,9 +7109,9 @@
         </w:pict>
       </w:r>
     </w:p>
-    <w:bookmarkEnd w:id="75"/>
-    <w:bookmarkEnd w:id="76"/>
-    <w:bookmarkStart w:id="77" w:name="Xc5bcb3243cad40239a8e0033af637955e44e197"/>
+    <w:bookmarkEnd w:id="79"/>
+    <w:bookmarkEnd w:id="80"/>
+    <w:bookmarkStart w:id="81" w:name="Xc5bcb3243cad40239a8e0033af637955e44e197"/>
     <w:p>
       <w:pPr>
         <w:pStyle w:val="Heading2"/>
@@ -5932,7 +7124,7 @@
       <w:pPr>
         <w:numPr>
           <w:ilvl w:val="0"/>
-          <w:numId w:val="1062"/>
+          <w:numId w:val="1073"/>
         </w:numPr>
         <w:pStyle w:val="Compact"/>
       </w:pPr>
@@ -5944,7 +7136,7 @@
       <w:pPr>
         <w:numPr>
           <w:ilvl w:val="0"/>
-          <w:numId w:val="1062"/>
+          <w:numId w:val="1073"/>
         </w:numPr>
         <w:pStyle w:val="Compact"/>
       </w:pPr>
@@ -5983,7 +7175,7 @@
       <w:pPr>
         <w:numPr>
           <w:ilvl w:val="0"/>
-          <w:numId w:val="1062"/>
+          <w:numId w:val="1073"/>
         </w:numPr>
         <w:pStyle w:val="Compact"/>
       </w:pPr>
@@ -5995,7 +7187,7 @@
       <w:pPr>
         <w:numPr>
           <w:ilvl w:val="0"/>
-          <w:numId w:val="1062"/>
+          <w:numId w:val="1073"/>
         </w:numPr>
         <w:pStyle w:val="Compact"/>
       </w:pPr>
@@ -6007,12 +7199,60 @@
       <w:pPr>
         <w:numPr>
           <w:ilvl w:val="0"/>
-          <w:numId w:val="1062"/>
+          <w:numId w:val="1073"/>
         </w:numPr>
         <w:pStyle w:val="Compact"/>
       </w:pPr>
       <w:r>
         <w:t xml:space="preserve">add structured logging and request IDs for traceability</w:t>
+      </w:r>
+    </w:p>
+    <w:p>
+      <w:pPr>
+        <w:numPr>
+          <w:ilvl w:val="0"/>
+          <w:numId w:val="1073"/>
+        </w:numPr>
+        <w:pStyle w:val="Compact"/>
+      </w:pPr>
+      <w:r>
+        <w:t xml:space="preserve">complete upstream merge of DB ingestion stream and document concrete DB schema/ORM model map</w:t>
+      </w:r>
+    </w:p>
+    <w:p>
+      <w:pPr>
+        <w:numPr>
+          <w:ilvl w:val="0"/>
+          <w:numId w:val="1073"/>
+        </w:numPr>
+        <w:pStyle w:val="Compact"/>
+      </w:pPr>
+      <w:r>
+        <w:t xml:space="preserve">add migration/runbook steps for bootstrapping DB data from canonical processed datasets</w:t>
+      </w:r>
+    </w:p>
+    <w:p>
+      <w:pPr>
+        <w:numPr>
+          <w:ilvl w:val="0"/>
+          <w:numId w:val="1073"/>
+        </w:numPr>
+        <w:pStyle w:val="Compact"/>
+      </w:pPr>
+      <w:r>
+        <w:t xml:space="preserve">define a single source of truth for dataset/series endpoint naming across file-backed and DB-backed modes</w:t>
+      </w:r>
+    </w:p>
+    <w:p>
+      <w:pPr>
+        <w:numPr>
+          <w:ilvl w:val="0"/>
+          <w:numId w:val="1073"/>
+        </w:numPr>
+        <w:pStyle w:val="Compact"/>
+      </w:pPr>
+      <w:r>
+        <w:t xml:space="preserve">align DS detector output schema (scores, labels, metadata) with API response contracts for frontend consumption</w:t>
       </w:r>
     </w:p>
     <w:p>
@@ -6022,8 +7262,8 @@
         </w:pict>
       </w:r>
     </w:p>
-    <w:bookmarkEnd w:id="77"/>
-    <w:bookmarkStart w:id="78" w:name="definition-of-done-for-lld-compliance"/>
+    <w:bookmarkEnd w:id="81"/>
+    <w:bookmarkStart w:id="82" w:name="definition-of-done-for-lld-compliance"/>
     <w:p>
       <w:pPr>
         <w:pStyle w:val="Heading2"/>
@@ -6044,7 +7284,7 @@
       <w:pPr>
         <w:numPr>
           <w:ilvl w:val="0"/>
-          <w:numId w:val="1063"/>
+          <w:numId w:val="1074"/>
         </w:numPr>
         <w:pStyle w:val="Compact"/>
       </w:pPr>
@@ -6056,7 +7296,7 @@
       <w:pPr>
         <w:numPr>
           <w:ilvl w:val="0"/>
-          <w:numId w:val="1063"/>
+          <w:numId w:val="1074"/>
         </w:numPr>
         <w:pStyle w:val="Compact"/>
       </w:pPr>
@@ -6068,7 +7308,7 @@
       <w:pPr>
         <w:numPr>
           <w:ilvl w:val="0"/>
-          <w:numId w:val="1063"/>
+          <w:numId w:val="1074"/>
         </w:numPr>
         <w:pStyle w:val="Compact"/>
       </w:pPr>
@@ -6080,7 +7320,7 @@
       <w:pPr>
         <w:numPr>
           <w:ilvl w:val="0"/>
-          <w:numId w:val="1063"/>
+          <w:numId w:val="1074"/>
         </w:numPr>
         <w:pStyle w:val="Compact"/>
       </w:pPr>
@@ -6092,7 +7332,7 @@
       <w:pPr>
         <w:numPr>
           <w:ilvl w:val="0"/>
-          <w:numId w:val="1063"/>
+          <w:numId w:val="1074"/>
         </w:numPr>
         <w:pStyle w:val="Compact"/>
       </w:pPr>
@@ -6100,8 +7340,8 @@
         <w:t xml:space="preserve">test coverage includes critical utility, service, and route behavior</w:t>
       </w:r>
     </w:p>
-    <w:bookmarkEnd w:id="78"/>
-    <w:bookmarkEnd w:id="79"/>
+    <w:bookmarkEnd w:id="82"/>
+    <w:bookmarkEnd w:id="83"/>
     <w:sectPr/>
   </w:body>
 </w:document>
@@ -6526,64 +7766,10 @@
     <w:abstractNumId w:val="991"/>
   </w:num>
   <w:num w:numId="1043">
-    <w:abstractNumId w:val="99411"/>
-    <w:lvlOverride w:ilvl="0">
-      <w:startOverride w:val="1"/>
-    </w:lvlOverride>
-    <w:lvlOverride w:ilvl="1">
-      <w:startOverride w:val="1"/>
-    </w:lvlOverride>
-    <w:lvlOverride w:ilvl="2">
-      <w:startOverride w:val="1"/>
-    </w:lvlOverride>
-    <w:lvlOverride w:ilvl="3">
-      <w:startOverride w:val="1"/>
-    </w:lvlOverride>
-    <w:lvlOverride w:ilvl="4">
-      <w:startOverride w:val="1"/>
-    </w:lvlOverride>
-    <w:lvlOverride w:ilvl="5">
-      <w:startOverride w:val="1"/>
-    </w:lvlOverride>
-    <w:lvlOverride w:ilvl="6">
-      <w:startOverride w:val="1"/>
-    </w:lvlOverride>
-    <w:lvlOverride w:ilvl="7">
-      <w:startOverride w:val="1"/>
-    </w:lvlOverride>
-    <w:lvlOverride w:ilvl="8">
-      <w:startOverride w:val="1"/>
-    </w:lvlOverride>
+    <w:abstractNumId w:val="991"/>
   </w:num>
   <w:num w:numId="1044">
-    <w:abstractNumId w:val="99411"/>
-    <w:lvlOverride w:ilvl="0">
-      <w:startOverride w:val="1"/>
-    </w:lvlOverride>
-    <w:lvlOverride w:ilvl="1">
-      <w:startOverride w:val="1"/>
-    </w:lvlOverride>
-    <w:lvlOverride w:ilvl="2">
-      <w:startOverride w:val="1"/>
-    </w:lvlOverride>
-    <w:lvlOverride w:ilvl="3">
-      <w:startOverride w:val="1"/>
-    </w:lvlOverride>
-    <w:lvlOverride w:ilvl="4">
-      <w:startOverride w:val="1"/>
-    </w:lvlOverride>
-    <w:lvlOverride w:ilvl="5">
-      <w:startOverride w:val="1"/>
-    </w:lvlOverride>
-    <w:lvlOverride w:ilvl="6">
-      <w:startOverride w:val="1"/>
-    </w:lvlOverride>
-    <w:lvlOverride w:ilvl="7">
-      <w:startOverride w:val="1"/>
-    </w:lvlOverride>
-    <w:lvlOverride w:ilvl="8">
-      <w:startOverride w:val="1"/>
-    </w:lvlOverride>
+    <w:abstractNumId w:val="991"/>
   </w:num>
   <w:num w:numId="1045">
     <w:abstractNumId w:val="99411"/>
@@ -6616,10 +7802,64 @@
     </w:lvlOverride>
   </w:num>
   <w:num w:numId="1046">
-    <w:abstractNumId w:val="991"/>
+    <w:abstractNumId w:val="99411"/>
+    <w:lvlOverride w:ilvl="0">
+      <w:startOverride w:val="1"/>
+    </w:lvlOverride>
+    <w:lvlOverride w:ilvl="1">
+      <w:startOverride w:val="1"/>
+    </w:lvlOverride>
+    <w:lvlOverride w:ilvl="2">
+      <w:startOverride w:val="1"/>
+    </w:lvlOverride>
+    <w:lvlOverride w:ilvl="3">
+      <w:startOverride w:val="1"/>
+    </w:lvlOverride>
+    <w:lvlOverride w:ilvl="4">
+      <w:startOverride w:val="1"/>
+    </w:lvlOverride>
+    <w:lvlOverride w:ilvl="5">
+      <w:startOverride w:val="1"/>
+    </w:lvlOverride>
+    <w:lvlOverride w:ilvl="6">
+      <w:startOverride w:val="1"/>
+    </w:lvlOverride>
+    <w:lvlOverride w:ilvl="7">
+      <w:startOverride w:val="1"/>
+    </w:lvlOverride>
+    <w:lvlOverride w:ilvl="8">
+      <w:startOverride w:val="1"/>
+    </w:lvlOverride>
   </w:num>
   <w:num w:numId="1047">
-    <w:abstractNumId w:val="991"/>
+    <w:abstractNumId w:val="99411"/>
+    <w:lvlOverride w:ilvl="0">
+      <w:startOverride w:val="1"/>
+    </w:lvlOverride>
+    <w:lvlOverride w:ilvl="1">
+      <w:startOverride w:val="1"/>
+    </w:lvlOverride>
+    <w:lvlOverride w:ilvl="2">
+      <w:startOverride w:val="1"/>
+    </w:lvlOverride>
+    <w:lvlOverride w:ilvl="3">
+      <w:startOverride w:val="1"/>
+    </w:lvlOverride>
+    <w:lvlOverride w:ilvl="4">
+      <w:startOverride w:val="1"/>
+    </w:lvlOverride>
+    <w:lvlOverride w:ilvl="5">
+      <w:startOverride w:val="1"/>
+    </w:lvlOverride>
+    <w:lvlOverride w:ilvl="6">
+      <w:startOverride w:val="1"/>
+    </w:lvlOverride>
+    <w:lvlOverride w:ilvl="7">
+      <w:startOverride w:val="1"/>
+    </w:lvlOverride>
+    <w:lvlOverride w:ilvl="8">
+      <w:startOverride w:val="1"/>
+    </w:lvlOverride>
   </w:num>
   <w:num w:numId="1048">
     <w:abstractNumId w:val="991"/>
@@ -6667,6 +7907,39 @@
     <w:abstractNumId w:val="991"/>
   </w:num>
   <w:num w:numId="1063">
+    <w:abstractNumId w:val="991"/>
+  </w:num>
+  <w:num w:numId="1064">
+    <w:abstractNumId w:val="991"/>
+  </w:num>
+  <w:num w:numId="1065">
+    <w:abstractNumId w:val="991"/>
+  </w:num>
+  <w:num w:numId="1066">
+    <w:abstractNumId w:val="991"/>
+  </w:num>
+  <w:num w:numId="1067">
+    <w:abstractNumId w:val="991"/>
+  </w:num>
+  <w:num w:numId="1068">
+    <w:abstractNumId w:val="991"/>
+  </w:num>
+  <w:num w:numId="1069">
+    <w:abstractNumId w:val="991"/>
+  </w:num>
+  <w:num w:numId="1070">
+    <w:abstractNumId w:val="991"/>
+  </w:num>
+  <w:num w:numId="1071">
+    <w:abstractNumId w:val="991"/>
+  </w:num>
+  <w:num w:numId="1072">
+    <w:abstractNumId w:val="991"/>
+  </w:num>
+  <w:num w:numId="1073">
+    <w:abstractNumId w:val="991"/>
+  </w:num>
+  <w:num w:numId="1074">
     <w:abstractNumId w:val="991"/>
   </w:num>
 </w:numbering>

</xml_diff>